<commit_message>
Belge arşivi: zümre seti 2026.08.1 + YENİ coğrafya yıllık planları seti 2026.08
- Zümre tutanakları 2026.08.1: coğrafya örneğinde (ZT-001-COG) TYMM 2026-2027
  kapsam teyidi, MEB çerçeve yıllık planı atfı, Kurban Bayramı/OTP yerleşimi
  ve OTP uygulama esasları (kaynak: evrakmotoru)
- Coğrafya yıllık planları (yeni set, 7 belge): MEB 2026-2027 çerçeve planından
  içerik değiştirilmeden A4 yatay kurulan 6 Excel planı + diğer branşlar için
  yapay zekâ komutlu (prompt) uyarlama rehberi
- Belge arşivi sayfası: Word/Excel biçim duyarlı etiketler; plan setine özgü
  kullanım kartları

Co-Authored-By: Claude Fable 5 <noreply@anthropic.com>
</commit_message>
<xml_diff>
--- a/public/evrak/zumre-tutanaklari/GNL-ZMR-ZT-001-COG_Cografya_Ders_Yili_Basi_Zumre_Tutanagi_2026-2027_v1.0.docx
+++ b/public/evrak/zumre-tutanaklari/GNL-ZMR-ZT-001-COG_Cografya_Ders_Yili_Basi_Zumre_Tutanagi_2026-2027_v1.0.docx
@@ -130,7 +130,7 @@
                 <w:i w:val="0"/>
                 <w:sz w:val="18"/>
               </w:rPr>
-              <w:t>• Toplantı öncesinde teyit edilecek iki husus: (1) Türkiye Yüzyılı Maarif Modeli'nin bu yıl kapsadığı sınıf düzeyleri (taslak 9, 10 ve 11. sınıf varsayımıyla kuruludur); (2) 11 ve 12. sınıflarda dört ve iki saatlik grupların şube listeleri ile hangi öğretmenin hangi grubu okuttuğu — madde 3 çizelgesi buna göre güncellenir.</w:t>
+              <w:t>• Türkiye Yüzyılı Maarif Modeli'nin 2026-2027 sınıf kapsamı doğrulanmıştır: Bakanlığın tymm.meb.gov.tr adresindeki duyurusuna göre model ortaöğretimde hazırlık, 9 ve 10. sınıflarda devam etmekte, 11. sınıflarda uygulanmaya başlamaktadır; aynı adreste yayımlanan 2026-2027 coğrafya taslak çerçeve yıllık planı da 9, 10 ve 11. sınıf sayfalarını bu programa, 12. sınıf sayfalarını 2018 programına göre vermektedir (erişim 29.08.2026). Toplantı öncesinde teyit edilecek husus: 11 ve 12. sınıflarda dört ve iki saatlik grupların şube listeleri ile hangi öğretmenin hangi grubu okuttuğu — madde 3 çizelgesi buna göre güncellenir.</w:t>
             </w:r>
           </w:p>
           <w:p>
@@ -214,7 +214,7 @@
                 <w:i w:val="0"/>
                 <w:sz w:val="18"/>
               </w:rPr>
-              <w:t>• Bu belge, okulapp.org üzerinde yayımlanan GENEL TUTANAK ŞABLONU setinin parçasıdır (sürüm: 2026.08 (28.08.2026)). Resmî bir Bakanlık belgesi değildir; okulun şartlarına ve toplantıda gerçekten görüşülen hususlara göre uyarlanır. Metindeki mevzuat atıfları 28.08.2026 tarihi itibarıyla yürürlükteki hükümlere göre yazılmıştır; kullanmadan önce güncelliği kontrol ediniz. Lisans: CC BY 4.0 — kaynak gösterilerek kullanılabilir ve uyarlanabilir.</w:t>
+              <w:t>• Bu belge, okulapp.org üzerinde yayımlanan GENEL TUTANAK ŞABLONU setinin parçasıdır (sürüm: 2026.08.1 (29.08.2026)). Resmî bir Bakanlık belgesi değildir; okulun şartlarına ve toplantıda gerçekten görüşülen hususlara göre uyarlanır. Metindeki mevzuat atıfları 28.08.2026 tarihi itibarıyla yürürlükteki hükümlere göre yazılmıştır; kullanmadan önce güncelliği kontrol ediniz. Lisans: CC BY 4.0 — kaynak gösterilerek kullanılabilir ve uyarlanabilir.</w:t>
             </w:r>
           </w:p>
           <w:p>
@@ -5693,6 +5693,20 @@
         <w:rPr>
           <w:b w:val="0"/>
           <w:i w:val="0"/>
+          <w:sz w:val="20"/>
+        </w:rPr>
+        <w:t>Bakanlığın 2026-2027 taslak çerçeve yıllık planlarının tymm.meb.gov.tr adresinde yayımlandığı ve coğrafya için altı varyantın tamamını karşıladığı görüldü. Yıllık planların bu çerçeve planlar esas alınıp içerik çerçevesi bozulmadan okula uyarlanması; uyarlamada il millî eğitim müdürlüğü çalışma takviminin gözetilmesi benimsendi. Bu kapsamda Kurban Bayramı tatilinin (15-19 Mayıs 2027) çerçeve planın 32. haftasına denk geldiği, o hafta yalnız perşembe ve cuma günleri ders yapılacağı; çerçeve planda okul temelli planlama süresinin 18. hafta (18-22 Ocak 2027) ile 36. hafta (14-18 Haziran 2027) örnek yerleşimiyle gösterildiği ve kesin yerleşimin zümre kararına bırakıldığı not edildi. Zümrece hazırlanan okula uyarlanmış plan taslakları toplantıda incelendi. Okul temelli planlama uygulamalarına ilişkin şu esaslar benimsendi: bu süre not amaçlı sınava dönüştürülmez, üretilen ürünler zümre kararıyla ilgili dönemin performans çalışması kapsamında değerlendirilebilir; öğrenme kanıtları sınıf düzeyi sorumlusunca zümre dosyasında toplanır ve yıl sonu toplantısında değerlendirilir; okul dışına çıkılmasını gerektiren çalışmalarda zaman-yer-refakat onayı ile etkinlik bazlı veli izni okulun sosyal etkinlik belgeleri üzerinden alınır; bilgisayar laboratuvarı gerektiren etkinliklerde laboratuvar takvimi en geç iki hafta önceden okul yönetimiyle kesinleştirilir.</w:t>
+      </w:r>
+    </w:p>
+    <w:p>
+      <w:pPr>
+        <w:spacing w:after="80" w:before="0"/>
+        <w:jc w:val="both"/>
+      </w:pPr>
+      <w:r>
+        <w:rPr>
+          <w:b w:val="0"/>
+          <w:i w:val="0"/>
           <w:color w:val="C00000"/>
           <w:sz w:val="20"/>
         </w:rPr>
@@ -5775,7 +5789,7 @@
           <w:i w:val="0"/>
           <w:sz w:val="20"/>
         </w:rPr>
-        <w:t xml:space="preserve">Yıllık planların altı set hâlinde (9, 10, 11-dört saatlik, 11-iki saatlik, 12-dört saatlik, 12-iki saatlik) madde 3'teki sınıf düzeyi sorumluları koordinasyonunda zümrece ortak hazırlanarak en geç </w:t>
+        <w:t xml:space="preserve">Yıllık planların altı set hâlinde (9, 10, 11-dört saatlik, 11-iki saatlik, 12-dört saatlik, 12-iki saatlik), Bakanlıkça tymm.meb.gov.tr adresinde yayımlanan 2026-2027 taslak çerçeve yıllık planları esas alınıp içerik çerçevesi korunarak ve okul çalışma takvimine uyarlanarak, madde 3'teki sınıf düzeyi sorumluları koordinasyonunda zümrece ortak hazırlanıp en geç </w:t>
       </w:r>
       <w:r>
         <w:rPr>
@@ -5815,7 +5829,7 @@
           <w:i w:val="0"/>
           <w:sz w:val="20"/>
         </w:rPr>
-        <w:t>Okul temelli planlama sürelerinin; 9. sınıfta okul çevresinde gözlem ve okuma çalışmalarına, 10. sınıfta program gereği meslek seçimi ve kariyer planlaması rehberliği ile yer şekilleri saha çalışmasına, 11. sınıfta her iki varyantta da web tabanlı coğrafi bilgi sistemleri uygulaması ve proje çalışmalarına ayrılmasına; kullanım planının yıllık planlarda gösterilmesine karar verildi.</w:t>
+        <w:t>Okul temelli planlama sürelerinin; 9. sınıfta okul çevresinde gözlem ve okuma çalışmalarına, 10. sınıfta program gereği meslek seçimi ve kariyer planlaması rehberliği ile yer şekilleri saha çalışmasına, 11. sınıfta her iki varyantta da web tabanlı coğrafi bilgi sistemleri uygulaması ve proje çalışmalarına ayrılmasına; bu sürelerin çerçeve planın örnek yerleşimine uygun olarak 18. hafta (18-22 Ocak 2027) ile 36. haftada (14-18 Haziran 2027) kullanılmasına (11. sınıf dört saatlik gruplarda 18. haftanın tamamı ile 36. haftanın iki saati); kullanım planının yıllık planlarda gösterilmesine karar verildi.</w:t>
       </w:r>
     </w:p>
     <w:p>

</xml_diff>